<commit_message>
project report is modified and added  & in docs forlder i add GitGraph (for git log)
</commit_message>
<xml_diff>
--- a/report/Hospital_Management_System_Report.docx
+++ b/report/Hospital_Management_System_Report.docx
@@ -2894,13 +2894,13 @@
           <w:u w:val="single"/>
         </w:rPr>
         <w:drawing>
-          <wp:anchor distT="0" distB="0" distL="114300" distR="114300" simplePos="0" relativeHeight="251660288" behindDoc="1" locked="0" layoutInCell="1" allowOverlap="1" wp14:anchorId="4AFDAF99" wp14:editId="050B5772">
+          <wp:anchor distT="0" distB="0" distL="114300" distR="114300" simplePos="0" relativeHeight="251660288" behindDoc="1" locked="0" layoutInCell="1" allowOverlap="1" wp14:anchorId="4AFDAF99" wp14:editId="156EE62C">
             <wp:simplePos x="0" y="0"/>
             <wp:positionH relativeFrom="margin">
               <wp:align>center</wp:align>
             </wp:positionH>
             <wp:positionV relativeFrom="paragraph">
-              <wp:posOffset>297815</wp:posOffset>
+              <wp:posOffset>259715</wp:posOffset>
             </wp:positionV>
             <wp:extent cx="5892800" cy="3270250"/>
             <wp:effectExtent l="0" t="0" r="0" b="6350"/>
@@ -3338,68 +3338,109 @@
       </w:r>
     </w:p>
     <w:p>
+      <w:pPr>
+        <w:rPr>
+          <w:b/>
+          <w:bCs/>
+          <w:u w:val="single"/>
+        </w:rPr>
+      </w:pPr>
       <w:hyperlink r:id="rId11" w:history="1">
         <w:r>
           <w:rPr>
             <w:rStyle w:val="Hyperlink"/>
+            <w:b/>
+            <w:bCs/>
           </w:rPr>
-          <w:t>JAVA_PROJECT_HOS</w:t>
+          <w:t xml:space="preserve">JAVA_PROJECT_HOSPITAL </w:t>
+        </w:r>
+        <w:proofErr w:type="gramStart"/>
+        <w:r>
+          <w:rPr>
+            <w:rStyle w:val="Hyperlink"/>
+            <w:b/>
+            <w:bCs/>
+          </w:rPr>
+          <w:t>( INITIAL</w:t>
+        </w:r>
+        <w:proofErr w:type="gramEnd"/>
+        <w:r>
+          <w:rPr>
+            <w:rStyle w:val="Hyperlink"/>
+            <w:b/>
+            <w:bCs/>
+          </w:rPr>
+          <w:t xml:space="preserve"> </w:t>
+        </w:r>
+        <w:proofErr w:type="gramStart"/>
+        <w:r>
+          <w:rPr>
+            <w:rStyle w:val="Hyperlink"/>
+            <w:b/>
+            <w:bCs/>
+          </w:rPr>
+          <w:t>PROPO</w:t>
+        </w:r>
+        <w:r>
+          <w:rPr>
+            <w:rStyle w:val="Hyperlink"/>
+            <w:b/>
+            <w:bCs/>
+          </w:rPr>
+          <w:t>S</w:t>
+        </w:r>
+        <w:r>
+          <w:rPr>
+            <w:rStyle w:val="Hyperlink"/>
+            <w:b/>
+            <w:bCs/>
+          </w:rPr>
+          <w:t>AL )</w:t>
+        </w:r>
+        <w:proofErr w:type="gramEnd"/>
+      </w:hyperlink>
+    </w:p>
+    <w:p>
+      <w:pPr>
+        <w:rPr>
+          <w:b/>
+          <w:bCs/>
+          <w:u w:val="single"/>
+        </w:rPr>
+      </w:pPr>
+      <w:r>
+        <w:rPr>
+          <w:b/>
+          <w:bCs/>
+          <w:u w:val="single"/>
+        </w:rPr>
+        <w:t>Review Mail</w:t>
+      </w:r>
+    </w:p>
+    <w:p>
+      <w:r>
+        <w:t xml:space="preserve"> approval email with APPROVED_MINOR</w:t>
+      </w:r>
+    </w:p>
+    <w:p>
+      <w:hyperlink r:id="rId12" w:history="1">
+        <w:r>
+          <w:rPr>
+            <w:rStyle w:val="Hyperlink"/>
+          </w:rPr>
+          <w:t>APPROVAL_</w:t>
         </w:r>
         <w:r>
           <w:rPr>
             <w:rStyle w:val="Hyperlink"/>
           </w:rPr>
-          <w:t>P</w:t>
+          <w:t>I</w:t>
         </w:r>
         <w:r>
           <w:rPr>
             <w:rStyle w:val="Hyperlink"/>
           </w:rPr>
-          <w:t>ITAL.pdf</w:t>
-        </w:r>
-      </w:hyperlink>
-    </w:p>
-    <w:p>
-      <w:pPr>
-        <w:rPr>
-          <w:b/>
-          <w:bCs/>
-          <w:u w:val="single"/>
-        </w:rPr>
-      </w:pPr>
-      <w:r>
-        <w:rPr>
-          <w:b/>
-          <w:bCs/>
-          <w:u w:val="single"/>
-        </w:rPr>
-        <w:t>Review Mail</w:t>
-      </w:r>
-    </w:p>
-    <w:p>
-      <w:r>
-        <w:t xml:space="preserve"> approval email with APPROVED_MINOR</w:t>
-      </w:r>
-    </w:p>
-    <w:p>
-      <w:hyperlink r:id="rId12" w:history="1">
-        <w:r>
-          <w:rPr>
-            <w:rStyle w:val="Hyperlink"/>
-          </w:rPr>
-          <w:t>Approval image.p</w:t>
-        </w:r>
-        <w:r>
-          <w:rPr>
-            <w:rStyle w:val="Hyperlink"/>
-          </w:rPr>
-          <w:t>n</w:t>
-        </w:r>
-        <w:r>
-          <w:rPr>
-            <w:rStyle w:val="Hyperlink"/>
-          </w:rPr>
-          <w:t>g</w:t>
+          <w:t>MAGE</w:t>
         </w:r>
       </w:hyperlink>
     </w:p>

</xml_diff>